<commit_message>
content(rmk-pert11): readability pass — segment dense B & D paragraphs (facts preserved)
Paragraph-break segmentation only; whitespace-normalized diff confirms zero word/
fact/citation drift. A restructured in prior task; C/E/F already well-segmented.

Co-Authored-By: Claude Opus 4.8 (1M context) <noreply@anthropic.com>
</commit_message>
<xml_diff>
--- a/rmk-pkk-pert11-efficient-securities-markets/output/01079_Kelompok 3_RMK Pert. 11.docx
+++ b/rmk-pkk-pert11-efficient-securities-markets/output/01079_Kelompok 3_RMK Pert. 11.docx
@@ -3949,7 +3949,22 @@
           <w:i w:val="0"/>
           <w:sz w:val="24"/>
         </w:rPr>
-        <w:t xml:space="preserve"> (setengah-kuat) dari Fama (1970): harga sekuritas pada setiap saat mencerminkan seluruh informasi yang diketahui publik. Dari definisi ini mengalir empat sifat — harga efisien hanya relatif terhadap informasi publik (sehingga tetap membuka ruang bagi </w:t>
+        <w:t xml:space="preserve"> (setengah-kuat) dari Fama (1970): harga sekuritas pada setiap saat mencerminkan seluruh informasi yang diketahui publik.</w:t>
+      </w:r>
+    </w:p>
+    <w:p>
+      <w:pPr>
+        <w:spacing w:line="360" w:lineRule="auto" w:before="0" w:after="80"/>
+        <w:jc w:val="both"/>
+      </w:pPr>
+      <w:r>
+        <w:rPr>
+          <w:rFonts w:ascii="Calibri" w:hAnsi="Calibri" w:cs="Calibri"/>
+          <w:b w:val="0"/>
+          <w:i w:val="0"/>
+          <w:sz w:val="24"/>
+        </w:rPr>
+        <w:t xml:space="preserve">Dari definisi ini mengalir empat sifat — harga efisien hanya relatif terhadap informasi publik (sehingga tetap membuka ruang bagi </w:t>
       </w:r>
       <w:r>
         <w:rPr>
@@ -4075,7 +4090,22 @@
           <w:i w:val="0"/>
           <w:sz w:val="24"/>
         </w:rPr>
-        <w:t xml:space="preserve">. Contoh ramalan sepak bola Beaver (1981) memperlihatkan bahwa harga konsensus mengungguli peramal individual mana pun, asalkan keputusan investor independen. Teori ini sempat tersandung inkonsistensi logis (Grossman, 1976) — bila harga sepenuhnya informatif, tak ada lagi insentif mencari informasi — yang diatasi lewat konsep </w:t>
+        <w:t>.</w:t>
+      </w:r>
+    </w:p>
+    <w:p>
+      <w:pPr>
+        <w:spacing w:line="360" w:lineRule="auto" w:before="0" w:after="80"/>
+        <w:jc w:val="both"/>
+      </w:pPr>
+      <w:r>
+        <w:rPr>
+          <w:rFonts w:ascii="Calibri" w:hAnsi="Calibri" w:cs="Calibri"/>
+          <w:b w:val="0"/>
+          <w:i w:val="0"/>
+          <w:sz w:val="24"/>
+        </w:rPr>
+        <w:t xml:space="preserve">Contoh ramalan sepak bola Beaver (1981) memperlihatkan bahwa harga konsensus mengungguli peramal individual mana pun, asalkan keputusan investor independen. Teori ini sempat tersandung inkonsistensi logis (Grossman, 1976) — bila harga sepenuhnya informatif, tak ada lagi insentif mencari informasi — yang diatasi lewat konsep </w:t>
       </w:r>
       <w:r>
         <w:rPr>
@@ -4252,7 +4282,22 @@
           <w:i w:val="0"/>
           <w:sz w:val="24"/>
         </w:rPr>
-        <w:t>. Di akar semua ini, alasan keberadaan akuntansi adalah asimetri informasi (</w:t>
+        <w:t>.</w:t>
+      </w:r>
+    </w:p>
+    <w:p>
+      <w:pPr>
+        <w:spacing w:line="360" w:lineRule="auto" w:before="0" w:after="80"/>
+        <w:jc w:val="both"/>
+      </w:pPr>
+      <w:r>
+        <w:rPr>
+          <w:rFonts w:ascii="Calibri" w:hAnsi="Calibri" w:cs="Calibri"/>
+          <w:b w:val="0"/>
+          <w:i w:val="0"/>
+          <w:sz w:val="24"/>
+        </w:rPr>
+        <w:t>Di akar semua ini, alasan keberadaan akuntansi adalah asimetri informasi (</w:t>
       </w:r>
       <w:r>
         <w:rPr>
@@ -4360,7 +4405,22 @@
           <w:i w:val="0"/>
           <w:sz w:val="24"/>
         </w:rPr>
-        <w:t xml:space="preserve"> (nilai fundamental) tak lain adalah informasi orang dalam, dan tugas pelaporan keuangan justru mengubah informasi dalam menjadi informasi luar agar pasar bekerja lebih baik. Pada akhirnya, karena pasar modal mengalokasikan modal yang langka dalam ekonomi kapitalis, pasar yang bekerja baik memiliki bobot sosial: ia mengarahkan modal ke proyek paling produktif, sebagaimana ditopang bukti empiris lintas-negara. Manfaat sosial ini tercapai sejauh dua syarat dipenuhi: seluruh informasi berguna tersedia bagi publik, dan harga pasar efisien relatif terhadap informasi publik tersebut (Scott, 2015).</w:t>
+        <w:t xml:space="preserve"> (nilai fundamental) tak lain adalah informasi orang dalam, dan tugas pelaporan keuangan justru mengubah informasi dalam menjadi informasi luar agar pasar bekerja lebih baik.</w:t>
+      </w:r>
+    </w:p>
+    <w:p>
+      <w:pPr>
+        <w:spacing w:line="360" w:lineRule="auto" w:before="0" w:after="80"/>
+        <w:jc w:val="both"/>
+      </w:pPr>
+      <w:r>
+        <w:rPr>
+          <w:rFonts w:ascii="Calibri" w:hAnsi="Calibri" w:cs="Calibri"/>
+          <w:b w:val="0"/>
+          <w:i w:val="0"/>
+          <w:sz w:val="24"/>
+        </w:rPr>
+        <w:t>Pada akhirnya, karena pasar modal mengalokasikan modal yang langka dalam ekonomi kapitalis, pasar yang bekerja baik memiliki bobot sosial: ia mengarahkan modal ke proyek paling produktif, sebagaimana ditopang bukti empiris lintas-negara. Manfaat sosial ini tercapai sejauh dua syarat dipenuhi: seluruh informasi berguna tersedia bagi publik, dan harga pasar efisien relatif terhadap informasi publik tersebut (Scott, 2015).</w:t>
       </w:r>
     </w:p>
     <w:p>
@@ -5095,7 +5155,22 @@
           <w:i w:val="0"/>
           <w:sz w:val="24"/>
         </w:rPr>
-        <w:t xml:space="preserve"> mencerminkan sepenuhnya seluruh informasi yang diketahui publik, sehingga yang dihargai pasar adalah muatan informasi, bukan bentuk pengungkapannya. Dari premis ini mengalir manfaat teoretis yang jernih. Efisiensi memberi alasan kuat bagi </w:t>
+        <w:t xml:space="preserve"> mencerminkan sepenuhnya seluruh informasi yang diketahui publik, sehingga yang dihargai pasar adalah muatan informasi, bukan bentuk pengungkapannya.</w:t>
+      </w:r>
+    </w:p>
+    <w:p>
+      <w:pPr>
+        <w:spacing w:line="360" w:lineRule="auto" w:before="0" w:after="80"/>
+        <w:jc w:val="both"/>
+      </w:pPr>
+      <w:r>
+        <w:rPr>
+          <w:rFonts w:ascii="Calibri" w:hAnsi="Calibri" w:cs="Calibri"/>
+          <w:b w:val="0"/>
+          <w:i w:val="0"/>
+          <w:sz w:val="24"/>
+        </w:rPr>
+        <w:t xml:space="preserve">Dari premis ini mengalir manfaat teoretis yang jernih. Efisiensi memberi alasan kuat bagi </w:t>
       </w:r>
       <w:r>
         <w:rPr>
@@ -5167,7 +5242,22 @@
           <w:i w:val="0"/>
           <w:sz w:val="24"/>
         </w:rPr>
-        <w:t xml:space="preserve">, sementara pelaporan berkualitas tinggi terbukti menggeser harga lebih dekat ke nilai fundamental serta memperbaiki alokasi modal yang langka. Kontribusi bab ini terletak pada caranya menyatukan tiga hal sekaligus: efisiensi pasar, rasionalitas </w:t>
+        <w:t>, sementara pelaporan berkualitas tinggi terbukti menggeser harga lebih dekat ke nilai fundamental serta memperbaiki alokasi modal yang langka.</w:t>
+      </w:r>
+    </w:p>
+    <w:p>
+      <w:pPr>
+        <w:spacing w:line="360" w:lineRule="auto" w:before="0" w:after="80"/>
+        <w:jc w:val="both"/>
+      </w:pPr>
+      <w:r>
+        <w:rPr>
+          <w:rFonts w:ascii="Calibri" w:hAnsi="Calibri" w:cs="Calibri"/>
+          <w:b w:val="0"/>
+          <w:i w:val="0"/>
+          <w:sz w:val="24"/>
+        </w:rPr>
+        <w:t xml:space="preserve">Kontribusi bab ini terletak pada caranya menyatukan tiga hal sekaligus: efisiensi pasar, rasionalitas </w:t>
       </w:r>
       <w:r>
         <w:rPr>

</xml_diff>